<commit_message>
Syllabus: set RTL and Hebrew as document-wide style defaults
Co-Authored-By: Claude Opus 5.5 <noreply@anthropic.com>
Claude-Session: https://claude.ai/code/session_01KYVx18xMYxByYxo559XEXy
</commit_message>
<xml_diff>
--- a/קורס בסיסי AI/סילבוס קורס AI בסיסי.docx
+++ b/קורס בסיסי AI/סילבוס קורס AI בסיסי.docx
@@ -5578,7 +5578,7 @@
         <w:rFonts w:asciiTheme="minorHAnsi" w:eastAsiaTheme="minorEastAsia" w:hAnsiTheme="minorHAnsi" w:cstheme="minorBidi"/>
         <w:sz w:val="22"/>
         <w:szCs w:val="22"/>
-        <w:lang w:val="en-US" w:eastAsia="en-US" w:bidi="ar-SA"/>
+        <w:lang w:val="he-IL" w:eastAsia="en-US" w:bidi="he-IL"/>
       </w:rPr>
     </w:rPrDefault>
     <w:pPrDefault>
@@ -5730,6 +5730,13 @@
     <w:name w:val="Normal"/>
     <w:qFormat/>
     <w:rsid w:val="00FC693F"/>
+    <w:pPr>
+      <w:bidi/>
+    </w:pPr>
+    <w:rPr>
+      <w:rtl/>
+      <w:lang w:val="he-IL" w:bidi="he-IL"/>
+    </w:rPr>
   </w:style>
   <w:style w:type="paragraph" w:styleId="Header">
     <w:name w:val="header"/>
@@ -5739,12 +5746,17 @@
     <w:unhideWhenUsed/>
     <w:rsid w:val="00E618BF"/>
     <w:pPr>
+      <w:bidi/>
       <w:tabs>
         <w:tab w:val="center" w:pos="4680"/>
         <w:tab w:val="right" w:pos="9360"/>
       </w:tabs>
       <w:spacing w:after="0" w:line="240" w:lineRule="auto"/>
     </w:pPr>
+    <w:rPr>
+      <w:rtl/>
+      <w:lang w:val="he-IL" w:bidi="he-IL"/>
+    </w:rPr>
   </w:style>
   <w:style w:type="character" w:customStyle="1" w:styleId="HeaderChar">
     <w:name w:val="Header Char"/>
@@ -5761,12 +5773,17 @@
     <w:unhideWhenUsed/>
     <w:rsid w:val="00E618BF"/>
     <w:pPr>
+      <w:bidi/>
       <w:tabs>
         <w:tab w:val="center" w:pos="4680"/>
         <w:tab w:val="right" w:pos="9360"/>
       </w:tabs>
       <w:spacing w:after="0" w:line="240" w:lineRule="auto"/>
     </w:pPr>
+    <w:rPr>
+      <w:rtl/>
+      <w:lang w:val="he-IL" w:bidi="he-IL"/>
+    </w:rPr>
   </w:style>
   <w:style w:type="character" w:customStyle="1" w:styleId="FooterChar">
     <w:name w:val="Footer Char"/>
@@ -5784,6 +5801,7 @@
     <w:qFormat/>
     <w:rsid w:val="00FC693F"/>
     <w:pPr>
+      <w:bidi/>
       <w:keepNext/>
       <w:keepLines/>
       <w:spacing w:before="480" w:after="0"/>
@@ -5796,6 +5814,8 @@
       <w:color w:val="365F91" w:themeColor="accent1" w:themeShade="BF"/>
       <w:sz w:val="28"/>
       <w:szCs w:val="28"/>
+      <w:rtl/>
+      <w:lang w:val="he-IL" w:bidi="he-IL"/>
     </w:rPr>
   </w:style>
   <w:style w:type="paragraph" w:styleId="Heading2">
@@ -5808,6 +5828,7 @@
     <w:qFormat/>
     <w:rsid w:val="00FC693F"/>
     <w:pPr>
+      <w:bidi/>
       <w:keepNext/>
       <w:keepLines/>
       <w:spacing w:before="200" w:after="0"/>
@@ -5820,6 +5841,8 @@
       <w:color w:val="4F81BD" w:themeColor="accent1"/>
       <w:sz w:val="26"/>
       <w:szCs w:val="26"/>
+      <w:rtl/>
+      <w:lang w:val="he-IL" w:bidi="he-IL"/>
     </w:rPr>
   </w:style>
   <w:style w:type="paragraph" w:styleId="Heading3">
@@ -5832,6 +5855,7 @@
     <w:qFormat/>
     <w:rsid w:val="00FC693F"/>
     <w:pPr>
+      <w:bidi/>
       <w:keepNext/>
       <w:keepLines/>
       <w:spacing w:before="200" w:after="0"/>
@@ -5842,6 +5866,8 @@
       <w:b/>
       <w:bCs/>
       <w:color w:val="4F81BD" w:themeColor="accent1"/>
+      <w:rtl/>
+      <w:lang w:val="he-IL" w:bidi="he-IL"/>
     </w:rPr>
   </w:style>
   <w:style w:type="paragraph" w:styleId="Heading4">
@@ -5855,6 +5881,7 @@
     <w:qFormat/>
     <w:rsid w:val="00FC693F"/>
     <w:pPr>
+      <w:bidi/>
       <w:keepNext/>
       <w:keepLines/>
       <w:spacing w:before="200" w:after="0"/>
@@ -5867,6 +5894,8 @@
       <w:i/>
       <w:iCs/>
       <w:color w:val="4F81BD" w:themeColor="accent1"/>
+      <w:rtl/>
+      <w:lang w:val="he-IL" w:bidi="he-IL"/>
     </w:rPr>
   </w:style>
   <w:style w:type="paragraph" w:styleId="Heading5">
@@ -5880,6 +5909,7 @@
     <w:qFormat/>
     <w:rsid w:val="00FC693F"/>
     <w:pPr>
+      <w:bidi/>
       <w:keepNext/>
       <w:keepLines/>
       <w:spacing w:before="200" w:after="0"/>
@@ -5888,6 +5918,8 @@
     <w:rPr>
       <w:rFonts w:asciiTheme="majorHAnsi" w:eastAsiaTheme="majorEastAsia" w:hAnsiTheme="majorHAnsi" w:cstheme="majorBidi"/>
       <w:color w:val="243F60" w:themeColor="accent1" w:themeShade="7F"/>
+      <w:rtl/>
+      <w:lang w:val="he-IL" w:bidi="he-IL"/>
     </w:rPr>
   </w:style>
   <w:style w:type="paragraph" w:styleId="Heading6">
@@ -5901,6 +5933,7 @@
     <w:qFormat/>
     <w:rsid w:val="00FC693F"/>
     <w:pPr>
+      <w:bidi/>
       <w:keepNext/>
       <w:keepLines/>
       <w:spacing w:before="200" w:after="0"/>
@@ -5911,6 +5944,8 @@
       <w:i/>
       <w:iCs/>
       <w:color w:val="243F60" w:themeColor="accent1" w:themeShade="7F"/>
+      <w:rtl/>
+      <w:lang w:val="he-IL" w:bidi="he-IL"/>
     </w:rPr>
   </w:style>
   <w:style w:type="paragraph" w:styleId="Heading7">
@@ -5924,6 +5959,7 @@
     <w:qFormat/>
     <w:rsid w:val="00FC693F"/>
     <w:pPr>
+      <w:bidi/>
       <w:keepNext/>
       <w:keepLines/>
       <w:spacing w:before="200" w:after="0"/>
@@ -5934,6 +5970,8 @@
       <w:i/>
       <w:iCs/>
       <w:color w:val="404040" w:themeColor="text1" w:themeTint="BF"/>
+      <w:rtl/>
+      <w:lang w:val="he-IL" w:bidi="he-IL"/>
     </w:rPr>
   </w:style>
   <w:style w:type="paragraph" w:styleId="Heading8">
@@ -5947,6 +5985,7 @@
     <w:qFormat/>
     <w:rsid w:val="00FC693F"/>
     <w:pPr>
+      <w:bidi/>
       <w:keepNext/>
       <w:keepLines/>
       <w:spacing w:before="200" w:after="0"/>
@@ -5957,6 +5996,8 @@
       <w:color w:val="4F81BD" w:themeColor="accent1"/>
       <w:sz w:val="20"/>
       <w:szCs w:val="20"/>
+      <w:rtl/>
+      <w:lang w:val="he-IL" w:bidi="he-IL"/>
     </w:rPr>
   </w:style>
   <w:style w:type="paragraph" w:styleId="Heading9">
@@ -5970,6 +6011,7 @@
     <w:qFormat/>
     <w:rsid w:val="00FC693F"/>
     <w:pPr>
+      <w:bidi/>
       <w:keepNext/>
       <w:keepLines/>
       <w:spacing w:before="200" w:after="0"/>
@@ -5982,6 +6024,8 @@
       <w:color w:val="404040" w:themeColor="text1" w:themeTint="BF"/>
       <w:sz w:val="20"/>
       <w:szCs w:val="20"/>
+      <w:rtl/>
+      <w:lang w:val="he-IL" w:bidi="he-IL"/>
     </w:rPr>
   </w:style>
   <w:style w:type="character" w:default="1" w:styleId="DefaultParagraphFont">
@@ -6017,8 +6061,13 @@
     <w:qFormat/>
     <w:rsid w:val="00FC693F"/>
     <w:pPr>
+      <w:bidi/>
       <w:spacing w:after="0" w:line="240" w:lineRule="auto"/>
     </w:pPr>
+    <w:rPr>
+      <w:rtl/>
+      <w:lang w:val="he-IL" w:bidi="he-IL"/>
+    </w:rPr>
   </w:style>
   <w:style w:type="character" w:customStyle="1" w:styleId="Heading1Char">
     <w:name w:val="Heading 1 Char"/>
@@ -6072,6 +6121,7 @@
     <w:qFormat/>
     <w:rsid w:val="00FC693F"/>
     <w:pPr>
+      <w:bidi/>
       <w:pBdr>
         <w:bottom w:val="single" w:sz="8" w:space="4" w:color="4F81BD" w:themeColor="accent1"/>
       </w:pBdr>
@@ -6085,6 +6135,8 @@
       <w:kern w:val="28"/>
       <w:sz w:val="52"/>
       <w:szCs w:val="52"/>
+      <w:rtl/>
+      <w:lang w:val="he-IL" w:bidi="he-IL"/>
     </w:rPr>
   </w:style>
   <w:style w:type="character" w:customStyle="1" w:styleId="TitleChar">
@@ -6111,6 +6163,7 @@
     <w:qFormat/>
     <w:rsid w:val="00FC693F"/>
     <w:pPr>
+      <w:bidi/>
       <w:numPr>
         <w:ilvl w:val="1"/>
       </w:numPr>
@@ -6123,6 +6176,8 @@
       <w:spacing w:val="15"/>
       <w:sz w:val="24"/>
       <w:szCs w:val="24"/>
+      <w:rtl/>
+      <w:lang w:val="he-IL" w:bidi="he-IL"/>
     </w:rPr>
   </w:style>
   <w:style w:type="character" w:customStyle="1" w:styleId="SubtitleChar">
@@ -6148,9 +6203,14 @@
     <w:qFormat/>
     <w:rsid w:val="00FC693F"/>
     <w:pPr>
+      <w:bidi/>
       <w:ind w:left="720"/>
       <w:contextualSpacing/>
     </w:pPr>
+    <w:rPr>
+      <w:rtl/>
+      <w:lang w:val="he-IL" w:bidi="he-IL"/>
+    </w:rPr>
   </w:style>
   <w:style w:type="paragraph" w:styleId="BodyText">
     <w:name w:val="Body Text"/>
@@ -6160,8 +6220,13 @@
     <w:unhideWhenUsed/>
     <w:rsid w:val="00AA1D8D"/>
     <w:pPr>
+      <w:bidi/>
       <w:spacing w:after="120"/>
     </w:pPr>
+    <w:rPr>
+      <w:rtl/>
+      <w:lang w:val="he-IL" w:bidi="he-IL"/>
+    </w:rPr>
   </w:style>
   <w:style w:type="character" w:customStyle="1" w:styleId="BodyTextChar">
     <w:name w:val="Body Text Char"/>
@@ -6178,8 +6243,13 @@
     <w:unhideWhenUsed/>
     <w:rsid w:val="00AA1D8D"/>
     <w:pPr>
+      <w:bidi/>
       <w:spacing w:after="120" w:line="480" w:lineRule="auto"/>
     </w:pPr>
+    <w:rPr>
+      <w:rtl/>
+      <w:lang w:val="he-IL" w:bidi="he-IL"/>
+    </w:rPr>
   </w:style>
   <w:style w:type="character" w:customStyle="1" w:styleId="BodyText2Char">
     <w:name w:val="Body Text 2 Char"/>
@@ -6196,11 +6266,14 @@
     <w:unhideWhenUsed/>
     <w:rsid w:val="00AA1D8D"/>
     <w:pPr>
+      <w:bidi/>
       <w:spacing w:after="120"/>
     </w:pPr>
     <w:rPr>
       <w:sz w:val="16"/>
       <w:szCs w:val="16"/>
+      <w:rtl/>
+      <w:lang w:val="he-IL" w:bidi="he-IL"/>
     </w:rPr>
   </w:style>
   <w:style w:type="character" w:customStyle="1" w:styleId="BodyText3Char">
@@ -6221,9 +6294,14 @@
     <w:unhideWhenUsed/>
     <w:rsid w:val="00AA1D8D"/>
     <w:pPr>
+      <w:bidi/>
       <w:ind w:left="360" w:hanging="360"/>
       <w:contextualSpacing/>
     </w:pPr>
+    <w:rPr>
+      <w:rtl/>
+      <w:lang w:val="he-IL" w:bidi="he-IL"/>
+    </w:rPr>
   </w:style>
   <w:style w:type="paragraph" w:styleId="List2">
     <w:name w:val="List 2"/>
@@ -6232,9 +6310,14 @@
     <w:unhideWhenUsed/>
     <w:rsid w:val="00326F90"/>
     <w:pPr>
+      <w:bidi/>
       <w:ind w:left="720" w:hanging="360"/>
       <w:contextualSpacing/>
     </w:pPr>
+    <w:rPr>
+      <w:rtl/>
+      <w:lang w:val="he-IL" w:bidi="he-IL"/>
+    </w:rPr>
   </w:style>
   <w:style w:type="paragraph" w:styleId="List3">
     <w:name w:val="List 3"/>
@@ -6243,9 +6326,14 @@
     <w:unhideWhenUsed/>
     <w:rsid w:val="00326F90"/>
     <w:pPr>
+      <w:bidi/>
       <w:ind w:left="1080" w:hanging="360"/>
       <w:contextualSpacing/>
     </w:pPr>
+    <w:rPr>
+      <w:rtl/>
+      <w:lang w:val="he-IL" w:bidi="he-IL"/>
+    </w:rPr>
   </w:style>
   <w:style w:type="paragraph" w:styleId="ListBullet">
     <w:name w:val="List Bullet"/>
@@ -6254,11 +6342,16 @@
     <w:unhideWhenUsed/>
     <w:rsid w:val="00326F90"/>
     <w:pPr>
+      <w:bidi/>
       <w:numPr>
         <w:numId w:val="1"/>
       </w:numPr>
       <w:contextualSpacing/>
     </w:pPr>
+    <w:rPr>
+      <w:rtl/>
+      <w:lang w:val="he-IL" w:bidi="he-IL"/>
+    </w:rPr>
   </w:style>
   <w:style w:type="paragraph" w:styleId="ListBullet2">
     <w:name w:val="List Bullet 2"/>
@@ -6267,11 +6360,16 @@
     <w:unhideWhenUsed/>
     <w:rsid w:val="00326F90"/>
     <w:pPr>
+      <w:bidi/>
       <w:numPr>
         <w:numId w:val="2"/>
       </w:numPr>
       <w:contextualSpacing/>
     </w:pPr>
+    <w:rPr>
+      <w:rtl/>
+      <w:lang w:val="he-IL" w:bidi="he-IL"/>
+    </w:rPr>
   </w:style>
   <w:style w:type="paragraph" w:styleId="ListBullet3">
     <w:name w:val="List Bullet 3"/>
@@ -6280,11 +6378,16 @@
     <w:unhideWhenUsed/>
     <w:rsid w:val="00326F90"/>
     <w:pPr>
+      <w:bidi/>
       <w:numPr>
         <w:numId w:val="3"/>
       </w:numPr>
       <w:contextualSpacing/>
     </w:pPr>
+    <w:rPr>
+      <w:rtl/>
+      <w:lang w:val="he-IL" w:bidi="he-IL"/>
+    </w:rPr>
   </w:style>
   <w:style w:type="paragraph" w:styleId="ListNumber">
     <w:name w:val="List Number"/>
@@ -6293,11 +6396,16 @@
     <w:unhideWhenUsed/>
     <w:rsid w:val="00326F90"/>
     <w:pPr>
+      <w:bidi/>
       <w:numPr>
         <w:numId w:val="5"/>
       </w:numPr>
       <w:contextualSpacing/>
     </w:pPr>
+    <w:rPr>
+      <w:rtl/>
+      <w:lang w:val="he-IL" w:bidi="he-IL"/>
+    </w:rPr>
   </w:style>
   <w:style w:type="paragraph" w:styleId="ListNumber2">
     <w:name w:val="List Number 2"/>
@@ -6306,11 +6414,16 @@
     <w:unhideWhenUsed/>
     <w:rsid w:val="0029639D"/>
     <w:pPr>
+      <w:bidi/>
       <w:numPr>
         <w:numId w:val="6"/>
       </w:numPr>
       <w:contextualSpacing/>
     </w:pPr>
+    <w:rPr>
+      <w:rtl/>
+      <w:lang w:val="he-IL" w:bidi="he-IL"/>
+    </w:rPr>
   </w:style>
   <w:style w:type="paragraph" w:styleId="ListNumber3">
     <w:name w:val="List Number 3"/>
@@ -6319,11 +6432,16 @@
     <w:unhideWhenUsed/>
     <w:rsid w:val="0029639D"/>
     <w:pPr>
+      <w:bidi/>
       <w:numPr>
         <w:numId w:val="7"/>
       </w:numPr>
       <w:contextualSpacing/>
     </w:pPr>
+    <w:rPr>
+      <w:rtl/>
+      <w:lang w:val="he-IL" w:bidi="he-IL"/>
+    </w:rPr>
   </w:style>
   <w:style w:type="paragraph" w:styleId="ListContinue">
     <w:name w:val="List Continue"/>
@@ -6332,10 +6450,15 @@
     <w:unhideWhenUsed/>
     <w:rsid w:val="0029639D"/>
     <w:pPr>
+      <w:bidi/>
       <w:spacing w:after="120"/>
       <w:ind w:left="360"/>
       <w:contextualSpacing/>
     </w:pPr>
+    <w:rPr>
+      <w:rtl/>
+      <w:lang w:val="he-IL" w:bidi="he-IL"/>
+    </w:rPr>
   </w:style>
   <w:style w:type="paragraph" w:styleId="ListContinue2">
     <w:name w:val="List Continue 2"/>
@@ -6344,10 +6467,15 @@
     <w:unhideWhenUsed/>
     <w:rsid w:val="0029639D"/>
     <w:pPr>
+      <w:bidi/>
       <w:spacing w:after="120"/>
       <w:ind w:left="720"/>
       <w:contextualSpacing/>
     </w:pPr>
+    <w:rPr>
+      <w:rtl/>
+      <w:lang w:val="he-IL" w:bidi="he-IL"/>
+    </w:rPr>
   </w:style>
   <w:style w:type="paragraph" w:styleId="ListContinue3">
     <w:name w:val="List Continue 3"/>
@@ -6356,10 +6484,15 @@
     <w:unhideWhenUsed/>
     <w:rsid w:val="0029639D"/>
     <w:pPr>
+      <w:bidi/>
       <w:spacing w:after="120"/>
       <w:ind w:left="1080"/>
       <w:contextualSpacing/>
     </w:pPr>
+    <w:rPr>
+      <w:rtl/>
+      <w:lang w:val="he-IL" w:bidi="he-IL"/>
+    </w:rPr>
   </w:style>
   <w:style w:type="paragraph" w:styleId="MacroText">
     <w:name w:val="macro"/>
@@ -6368,6 +6501,7 @@
     <w:unhideWhenUsed/>
     <w:rsid w:val="0029639D"/>
     <w:pPr>
+      <w:bidi/>
       <w:tabs>
         <w:tab w:val="left" w:pos="576"/>
         <w:tab w:val="left" w:pos="1152"/>
@@ -6382,6 +6516,8 @@
       <w:rFonts w:ascii="Courier" w:hAnsi="Courier"/>
       <w:sz w:val="20"/>
       <w:szCs w:val="20"/>
+      <w:rtl/>
+      <w:lang w:val="he-IL" w:bidi="he-IL"/>
     </w:rPr>
   </w:style>
   <w:style w:type="character" w:customStyle="1" w:styleId="MacroTextChar">
@@ -6404,10 +6540,15 @@
     <w:uiPriority w:val="29"/>
     <w:qFormat/>
     <w:rsid w:val="00FC693F"/>
+    <w:pPr>
+      <w:bidi/>
+    </w:pPr>
     <w:rPr>
       <w:i/>
       <w:iCs/>
       <w:color w:val="000000" w:themeColor="text1"/>
+      <w:rtl/>
+      <w:lang w:val="he-IL" w:bidi="he-IL"/>
     </w:rPr>
   </w:style>
   <w:style w:type="character" w:customStyle="1" w:styleId="QuoteChar">
@@ -6518,6 +6659,7 @@
     <w:qFormat/>
     <w:rsid w:val="00FC693F"/>
     <w:pPr>
+      <w:bidi/>
       <w:spacing w:line="240" w:lineRule="auto"/>
     </w:pPr>
     <w:rPr>
@@ -6526,6 +6668,8 @@
       <w:color w:val="4F81BD" w:themeColor="accent1"/>
       <w:sz w:val="18"/>
       <w:szCs w:val="18"/>
+      <w:rtl/>
+      <w:lang w:val="he-IL" w:bidi="he-IL"/>
     </w:rPr>
   </w:style>
   <w:style w:type="character" w:styleId="Strong">
@@ -6559,6 +6703,7 @@
     <w:qFormat/>
     <w:rsid w:val="00FC693F"/>
     <w:pPr>
+      <w:bidi/>
       <w:pBdr>
         <w:bottom w:val="single" w:sz="4" w:space="4" w:color="4F81BD" w:themeColor="accent1"/>
       </w:pBdr>
@@ -6571,6 +6716,8 @@
       <w:i/>
       <w:iCs/>
       <w:color w:val="4F81BD" w:themeColor="accent1"/>
+      <w:rtl/>
+      <w:lang w:val="he-IL" w:bidi="he-IL"/>
     </w:rPr>
   </w:style>
   <w:style w:type="character" w:customStyle="1" w:styleId="IntenseQuoteChar">
@@ -6663,8 +6810,13 @@
     <w:qFormat/>
     <w:rsid w:val="00FC693F"/>
     <w:pPr>
+      <w:bidi/>
       <w:outlineLvl w:val="9"/>
     </w:pPr>
+    <w:rPr>
+      <w:rtl/>
+      <w:lang w:val="he-IL" w:bidi="he-IL"/>
+    </w:rPr>
   </w:style>
   <w:style w:type="table" w:styleId="TableGrid">
     <w:name w:val="Table Grid"/>

</xml_diff>